<commit_message>
Close MKTG as unsuccessful, add Substack and Daphne/Jean Media strands
MKTG moves from parked to CLOSED (lost — no follow-up since the June
12 interview). Two new ACTIVE consultancy pipeline entries added:
Substack (positive discussions with Nick Asiama and Neil White) and
Daphne / Jean Media (exploratory discussions). status.md and
consultancy.md updated to stay in sync with the pipeline tracker.

Co-Authored-By: Claude Sonnet 5 <noreply@anthropic.com>
Claude-Session: https://claude.ai/code/session_01NDaKuHAfjyyZNaBefdBahF
</commit_message>
<xml_diff>
--- a/pipeline.md.docx
+++ b/pipeline.md.docx
@@ -28,7 +28,7 @@
         <w:rPr>
           <w:rtl w:val="0"/>
         </w:rPr>
-        <w:t xml:space="preserve">type: pipeline last_updated: 2026-06-30</w:t>
+        <w:t>type: pipeline last_updated: 2026-07-03</w:t>
       </w:r>
     </w:p>
     <w:p>
@@ -433,6 +433,210 @@
           </w:p>
         </w:tc>
       </w:tr>
+      <w:tr>
+        <w:trPr>
+          <w:cantSplit w:val="0"/>
+          <w:tblHeader w:val="0"/>
+        </w:trPr>
+        <w:tc>
+          <w:tcPr>
+            <w:shd w:fill="auto" w:val="clear"/>
+            <w:tcMar>
+              <w:top w:w="100.0" w:type="dxa"/>
+              <w:left w:w="100.0" w:type="dxa"/>
+              <w:bottom w:w="100.0" w:type="dxa"/>
+              <w:right w:w="100.0" w:type="dxa"/>
+            </w:tcMar>
+            <w:vAlign w:val="top"/>
+          </w:tcPr>
+          <w:p>
+            <w:pPr>
+              <w:jc w:val="left"/>
+              <w:rPr/>
+            </w:pPr>
+            <w:r>
+              <w:rPr>
+                <w:rtl w:val="0"/>
+              </w:rPr>
+              <w:t>Substack</w:t>
+            </w:r>
+          </w:p>
+        </w:tc>
+        <w:tc>
+          <w:tcPr>
+            <w:shd w:fill="auto" w:val="clear"/>
+            <w:tcMar>
+              <w:top w:w="100.0" w:type="dxa"/>
+              <w:left w:w="100.0" w:type="dxa"/>
+              <w:bottom w:w="100.0" w:type="dxa"/>
+              <w:right w:w="100.0" w:type="dxa"/>
+            </w:tcMar>
+            <w:vAlign w:val="top"/>
+          </w:tcPr>
+          <w:p>
+            <w:pPr>
+              <w:jc w:val="left"/>
+              <w:rPr/>
+            </w:pPr>
+            <w:r>
+              <w:rPr>
+                <w:rtl w:val="0"/>
+              </w:rPr>
+              <w:t>Consultancy (X)</w:t>
+            </w:r>
+          </w:p>
+        </w:tc>
+        <w:tc>
+          <w:tcPr>
+            <w:shd w:fill="auto" w:val="clear"/>
+            <w:tcMar>
+              <w:top w:w="100.0" w:type="dxa"/>
+              <w:left w:w="100.0" w:type="dxa"/>
+              <w:bottom w:w="100.0" w:type="dxa"/>
+              <w:right w:w="100.0" w:type="dxa"/>
+            </w:tcMar>
+            <w:vAlign w:val="top"/>
+          </w:tcPr>
+          <w:p>
+            <w:pPr>
+              <w:jc w:val="left"/>
+              <w:rPr/>
+            </w:pPr>
+            <w:r>
+              <w:rPr>
+                <w:rtl w:val="0"/>
+              </w:rPr>
+              <w:t>Positive discussions with Nick Asiama and Neil White</w:t>
+            </w:r>
+          </w:p>
+        </w:tc>
+        <w:tc>
+          <w:tcPr>
+            <w:shd w:fill="auto" w:val="clear"/>
+            <w:tcMar>
+              <w:top w:w="100.0" w:type="dxa"/>
+              <w:left w:w="100.0" w:type="dxa"/>
+              <w:bottom w:w="100.0" w:type="dxa"/>
+              <w:right w:w="100.0" w:type="dxa"/>
+            </w:tcMar>
+            <w:vAlign w:val="top"/>
+          </w:tcPr>
+          <w:p>
+            <w:pPr>
+              <w:jc w:val="left"/>
+              <w:rPr/>
+            </w:pPr>
+            <w:r>
+              <w:rPr>
+                <w:rtl w:val="0"/>
+              </w:rPr>
+              <w:t>2026-07-03</w:t>
+            </w:r>
+          </w:p>
+        </w:tc>
+      </w:tr>
+      <w:tr>
+        <w:trPr>
+          <w:cantSplit w:val="0"/>
+          <w:tblHeader w:val="0"/>
+        </w:trPr>
+        <w:tc>
+          <w:tcPr>
+            <w:shd w:fill="auto" w:val="clear"/>
+            <w:tcMar>
+              <w:top w:w="100.0" w:type="dxa"/>
+              <w:left w:w="100.0" w:type="dxa"/>
+              <w:bottom w:w="100.0" w:type="dxa"/>
+              <w:right w:w="100.0" w:type="dxa"/>
+            </w:tcMar>
+            <w:vAlign w:val="top"/>
+          </w:tcPr>
+          <w:p>
+            <w:pPr>
+              <w:jc w:val="left"/>
+              <w:rPr/>
+            </w:pPr>
+            <w:r>
+              <w:rPr>
+                <w:rtl w:val="0"/>
+              </w:rPr>
+              <w:t>Daphne / Jean Media</w:t>
+            </w:r>
+          </w:p>
+        </w:tc>
+        <w:tc>
+          <w:tcPr>
+            <w:shd w:fill="auto" w:val="clear"/>
+            <w:tcMar>
+              <w:top w:w="100.0" w:type="dxa"/>
+              <w:left w:w="100.0" w:type="dxa"/>
+              <w:bottom w:w="100.0" w:type="dxa"/>
+              <w:right w:w="100.0" w:type="dxa"/>
+            </w:tcMar>
+            <w:vAlign w:val="top"/>
+          </w:tcPr>
+          <w:p>
+            <w:pPr>
+              <w:jc w:val="left"/>
+              <w:rPr/>
+            </w:pPr>
+            <w:r>
+              <w:rPr>
+                <w:rtl w:val="0"/>
+              </w:rPr>
+              <w:t>Consultancy (X)</w:t>
+            </w:r>
+          </w:p>
+        </w:tc>
+        <w:tc>
+          <w:tcPr>
+            <w:shd w:fill="auto" w:val="clear"/>
+            <w:tcMar>
+              <w:top w:w="100.0" w:type="dxa"/>
+              <w:left w:w="100.0" w:type="dxa"/>
+              <w:bottom w:w="100.0" w:type="dxa"/>
+              <w:right w:w="100.0" w:type="dxa"/>
+            </w:tcMar>
+            <w:vAlign w:val="top"/>
+          </w:tcPr>
+          <w:p>
+            <w:pPr>
+              <w:jc w:val="left"/>
+              <w:rPr/>
+            </w:pPr>
+            <w:r>
+              <w:rPr>
+                <w:rtl w:val="0"/>
+              </w:rPr>
+              <w:t>Exploratory discussions</w:t>
+            </w:r>
+          </w:p>
+        </w:tc>
+        <w:tc>
+          <w:tcPr>
+            <w:shd w:fill="auto" w:val="clear"/>
+            <w:tcMar>
+              <w:top w:w="100.0" w:type="dxa"/>
+              <w:left w:w="100.0" w:type="dxa"/>
+              <w:bottom w:w="100.0" w:type="dxa"/>
+              <w:right w:w="100.0" w:type="dxa"/>
+            </w:tcMar>
+            <w:vAlign w:val="top"/>
+          </w:tcPr>
+          <w:p>
+            <w:pPr>
+              <w:jc w:val="left"/>
+              <w:rPr/>
+            </w:pPr>
+            <w:r>
+              <w:rPr>
+                <w:rtl w:val="0"/>
+              </w:rPr>
+              <w:t>2026-07-03</w:t>
+            </w:r>
+          </w:p>
+        </w:tc>
+      </w:tr>
     </w:tbl>
     <w:p>
       <w:pPr>
@@ -1082,79 +1286,79 @@
               <w:rPr>
                 <w:rtl w:val="0"/>
               </w:rPr>
-              <w:t xml:space="preserve">—</w:t>
-            </w:r>
-          </w:p>
-        </w:tc>
-        <w:tc>
-          <w:tcPr>
-            <w:shd w:fill="auto" w:val="clear"/>
-            <w:tcMar>
-              <w:top w:w="100.0" w:type="dxa"/>
-              <w:left w:w="100.0" w:type="dxa"/>
-              <w:bottom w:w="100.0" w:type="dxa"/>
-              <w:right w:w="100.0" w:type="dxa"/>
-            </w:tcMar>
-            <w:vAlign w:val="top"/>
-          </w:tcPr>
-          <w:p>
-            <w:pPr>
-              <w:jc w:val="left"/>
-              <w:rPr/>
-            </w:pPr>
-            <w:r>
-              <w:rPr>
-                <w:rtl w:val="0"/>
-              </w:rPr>
-              <w:t xml:space="preserve">—</w:t>
-            </w:r>
-          </w:p>
-        </w:tc>
-        <w:tc>
-          <w:tcPr>
-            <w:shd w:fill="auto" w:val="clear"/>
-            <w:tcMar>
-              <w:top w:w="100.0" w:type="dxa"/>
-              <w:left w:w="100.0" w:type="dxa"/>
-              <w:bottom w:w="100.0" w:type="dxa"/>
-              <w:right w:w="100.0" w:type="dxa"/>
-            </w:tcMar>
-            <w:vAlign w:val="top"/>
-          </w:tcPr>
-          <w:p>
-            <w:pPr>
-              <w:jc w:val="left"/>
-              <w:rPr/>
-            </w:pPr>
-            <w:r>
-              <w:rPr>
-                <w:rtl w:val="0"/>
-              </w:rPr>
-              <w:t xml:space="preserve">—</w:t>
-            </w:r>
-          </w:p>
-        </w:tc>
-        <w:tc>
-          <w:tcPr>
-            <w:shd w:fill="auto" w:val="clear"/>
-            <w:tcMar>
-              <w:top w:w="100.0" w:type="dxa"/>
-              <w:left w:w="100.0" w:type="dxa"/>
-              <w:bottom w:w="100.0" w:type="dxa"/>
-              <w:right w:w="100.0" w:type="dxa"/>
-            </w:tcMar>
-            <w:vAlign w:val="top"/>
-          </w:tcPr>
-          <w:p>
-            <w:pPr>
-              <w:jc w:val="left"/>
-              <w:rPr/>
-            </w:pPr>
-            <w:r>
-              <w:rPr>
-                <w:rtl w:val="0"/>
-              </w:rPr>
-              <w:t xml:space="preserve">No closures yet — baseline week</w:t>
+              <w:t>MKTG Business Director</w:t>
+            </w:r>
+          </w:p>
+        </w:tc>
+        <w:tc>
+          <w:tcPr>
+            <w:shd w:fill="auto" w:val="clear"/>
+            <w:tcMar>
+              <w:top w:w="100.0" w:type="dxa"/>
+              <w:left w:w="100.0" w:type="dxa"/>
+              <w:bottom w:w="100.0" w:type="dxa"/>
+              <w:right w:w="100.0" w:type="dxa"/>
+            </w:tcMar>
+            <w:vAlign w:val="top"/>
+          </w:tcPr>
+          <w:p>
+            <w:pPr>
+              <w:jc w:val="left"/>
+              <w:rPr/>
+            </w:pPr>
+            <w:r>
+              <w:rPr>
+                <w:rtl w:val="0"/>
+              </w:rPr>
+              <w:t>Corporate (Y)</w:t>
+            </w:r>
+          </w:p>
+        </w:tc>
+        <w:tc>
+          <w:tcPr>
+            <w:shd w:fill="auto" w:val="clear"/>
+            <w:tcMar>
+              <w:top w:w="100.0" w:type="dxa"/>
+              <w:left w:w="100.0" w:type="dxa"/>
+              <w:bottom w:w="100.0" w:type="dxa"/>
+              <w:right w:w="100.0" w:type="dxa"/>
+            </w:tcMar>
+            <w:vAlign w:val="top"/>
+          </w:tcPr>
+          <w:p>
+            <w:pPr>
+              <w:jc w:val="left"/>
+              <w:rPr/>
+            </w:pPr>
+            <w:r>
+              <w:rPr>
+                <w:rtl w:val="0"/>
+              </w:rPr>
+              <w:t>Lost</w:t>
+            </w:r>
+          </w:p>
+        </w:tc>
+        <w:tc>
+          <w:tcPr>
+            <w:shd w:fill="auto" w:val="clear"/>
+            <w:tcMar>
+              <w:top w:w="100.0" w:type="dxa"/>
+              <w:left w:w="100.0" w:type="dxa"/>
+              <w:bottom w:w="100.0" w:type="dxa"/>
+              <w:right w:w="100.0" w:type="dxa"/>
+            </w:tcMar>
+            <w:vAlign w:val="top"/>
+          </w:tcPr>
+          <w:p>
+            <w:pPr>
+              <w:jc w:val="left"/>
+              <w:rPr/>
+            </w:pPr>
+            <w:r>
+              <w:rPr>
+                <w:rtl w:val="0"/>
+              </w:rPr>
+              <w:t>Unsuccessful — no follow-up since June 12 interview</w:t>
             </w:r>
           </w:p>
         </w:tc>
@@ -1360,55 +1564,55 @@
               <w:rPr>
                 <w:rtl w:val="0"/>
               </w:rPr>
-              <w:t xml:space="preserve">MKTG Business Director</w:t>
-            </w:r>
-          </w:p>
-        </w:tc>
-        <w:tc>
-          <w:tcPr>
-            <w:shd w:fill="auto" w:val="clear"/>
-            <w:tcMar>
-              <w:top w:w="100.0" w:type="dxa"/>
-              <w:left w:w="100.0" w:type="dxa"/>
-              <w:bottom w:w="100.0" w:type="dxa"/>
-              <w:right w:w="100.0" w:type="dxa"/>
-            </w:tcMar>
-            <w:vAlign w:val="top"/>
-          </w:tcPr>
-          <w:p>
-            <w:pPr>
-              <w:jc w:val="left"/>
-              <w:rPr/>
-            </w:pPr>
-            <w:r>
-              <w:rPr>
-                <w:rtl w:val="0"/>
-              </w:rPr>
-              <w:t xml:space="preserve">Corporate (Y)</w:t>
-            </w:r>
-          </w:p>
-        </w:tc>
-        <w:tc>
-          <w:tcPr>
-            <w:shd w:fill="auto" w:val="clear"/>
-            <w:tcMar>
-              <w:top w:w="100.0" w:type="dxa"/>
-              <w:left w:w="100.0" w:type="dxa"/>
-              <w:bottom w:w="100.0" w:type="dxa"/>
-              <w:right w:w="100.0" w:type="dxa"/>
-            </w:tcMar>
-            <w:vAlign w:val="top"/>
-          </w:tcPr>
-          <w:p>
-            <w:pPr>
-              <w:jc w:val="left"/>
-              <w:rPr/>
-            </w:pPr>
-            <w:r>
-              <w:rPr>
-                <w:rtl w:val="0"/>
-              </w:rPr>
-              <w:t xml:space="preserve">6-month FTC, below target salary — managed reactively only</w:t>
+              <w:t>—</w:t>
+            </w:r>
+          </w:p>
+        </w:tc>
+        <w:tc>
+          <w:tcPr>
+            <w:shd w:fill="auto" w:val="clear"/>
+            <w:tcMar>
+              <w:top w:w="100.0" w:type="dxa"/>
+              <w:left w:w="100.0" w:type="dxa"/>
+              <w:bottom w:w="100.0" w:type="dxa"/>
+              <w:right w:w="100.0" w:type="dxa"/>
+            </w:tcMar>
+            <w:vAlign w:val="top"/>
+          </w:tcPr>
+          <w:p>
+            <w:pPr>
+              <w:jc w:val="left"/>
+              <w:rPr/>
+            </w:pPr>
+            <w:r>
+              <w:rPr>
+                <w:rtl w:val="0"/>
+              </w:rPr>
+              <w:t>—</w:t>
+            </w:r>
+          </w:p>
+        </w:tc>
+        <w:tc>
+          <w:tcPr>
+            <w:shd w:fill="auto" w:val="clear"/>
+            <w:tcMar>
+              <w:top w:w="100.0" w:type="dxa"/>
+              <w:left w:w="100.0" w:type="dxa"/>
+              <w:bottom w:w="100.0" w:type="dxa"/>
+              <w:right w:w="100.0" w:type="dxa"/>
+            </w:tcMar>
+            <w:vAlign w:val="top"/>
+          </w:tcPr>
+          <w:p>
+            <w:pPr>
+              <w:jc w:val="left"/>
+              <w:rPr/>
+            </w:pPr>
+            <w:r>
+              <w:rPr>
+                <w:rtl w:val="0"/>
+              </w:rPr>
+              <w:t>Nothing parked currently</w:t>
             </w:r>
           </w:p>
         </w:tc>

</xml_diff>

<commit_message>
Run weekly retro for 2026-07-31
Reconciles pipeline.md.docx against calendar/email evidence (merges the
duplicated Racing TV / RMG entry, logs the new Jean Marais/E2 lead, flags
ThriveWell Hub's paid-status as a 4+ week open loop) and adds the first
retro write-up now that a month has passed since the 30 June baseline.

Co-Authored-By: Claude Sonnet 5 <noreply@anthropic.com>
Claude-Session: https://claude.ai/code/session_0129UWB2tYGmM5x4tx6M8aVR
</commit_message>
<xml_diff>
--- a/pipeline.md.docx
+++ b/pipeline.md.docx
@@ -28,7 +28,7 @@
         <w:rPr>
           <w:rtl w:val="0"/>
         </w:rPr>
-        <w:t xml:space="preserve">type: pipeline last_updated: 2026-06-30</w:t>
+        <w:t xml:space="preserve">type: pipeline last_updated: 2026-07-31</w:t>
       </w:r>
     </w:p>
     <w:p>
@@ -433,6 +433,108 @@
           </w:p>
         </w:tc>
       </w:tr>
+      <w:tr>
+        <w:trPr>
+          <w:cantSplit w:val="0"/>
+          <w:tblHeader w:val="0"/>
+        </w:trPr>
+        <w:tc>
+          <w:tcPr>
+            <w:shd w:fill="auto" w:val="clear"/>
+            <w:tcMar>
+              <w:top w:w="100.0" w:type="dxa"/>
+              <w:left w:w="100.0" w:type="dxa"/>
+              <w:bottom w:w="100.0" w:type="dxa"/>
+              <w:right w:w="100.0" w:type="dxa"/>
+            </w:tcMar>
+            <w:vAlign w:val="top"/>
+          </w:tcPr>
+          <w:p>
+            <w:pPr>
+              <w:jc w:val="left"/>
+              <w:rPr/>
+            </w:pPr>
+            <w:r>
+              <w:rPr>
+                <w:rtl w:val="0"/>
+              </w:rPr>
+              <w:t xml:space="preserve">Jean Marais / E2 (Oddsserve)</w:t>
+            </w:r>
+          </w:p>
+        </w:tc>
+        <w:tc>
+          <w:tcPr>
+            <w:shd w:fill="auto" w:val="clear"/>
+            <w:tcMar>
+              <w:top w:w="100.0" w:type="dxa"/>
+              <w:left w:w="100.0" w:type="dxa"/>
+              <w:bottom w:w="100.0" w:type="dxa"/>
+              <w:right w:w="100.0" w:type="dxa"/>
+            </w:tcMar>
+            <w:vAlign w:val="top"/>
+          </w:tcPr>
+          <w:p>
+            <w:pPr>
+              <w:jc w:val="left"/>
+              <w:rPr/>
+            </w:pPr>
+            <w:r>
+              <w:rPr>
+                <w:rtl w:val="0"/>
+              </w:rPr>
+              <w:t xml:space="preserve">Consultancy / referral</w:t>
+            </w:r>
+          </w:p>
+        </w:tc>
+        <w:tc>
+          <w:tcPr>
+            <w:shd w:fill="auto" w:val="clear"/>
+            <w:tcMar>
+              <w:top w:w="100.0" w:type="dxa"/>
+              <w:left w:w="100.0" w:type="dxa"/>
+              <w:bottom w:w="100.0" w:type="dxa"/>
+              <w:right w:w="100.0" w:type="dxa"/>
+            </w:tcMar>
+            <w:vAlign w:val="top"/>
+          </w:tcPr>
+          <w:p>
+            <w:pPr>
+              <w:jc w:val="left"/>
+              <w:rPr/>
+            </w:pPr>
+            <w:r>
+              <w:rPr>
+                <w:rtl w:val="0"/>
+              </w:rPr>
+              <w:t xml:space="preserve">New lead surfaced via Jean Marais ~29 July 2026 re: Oddsserve Live &amp; Pre-Match opportunity; follow-up expected when Jean is back. Not yet progressed beyond initial mention.</w:t>
+            </w:r>
+          </w:p>
+        </w:tc>
+        <w:tc>
+          <w:tcPr>
+            <w:shd w:fill="auto" w:val="clear"/>
+            <w:tcMar>
+              <w:top w:w="100.0" w:type="dxa"/>
+              <w:left w:w="100.0" w:type="dxa"/>
+              <w:bottom w:w="100.0" w:type="dxa"/>
+              <w:right w:w="100.0" w:type="dxa"/>
+            </w:tcMar>
+            <w:vAlign w:val="top"/>
+          </w:tcPr>
+          <w:p>
+            <w:pPr>
+              <w:jc w:val="left"/>
+              <w:rPr/>
+            </w:pPr>
+            <w:r>
+              <w:rPr>
+                <w:rtl w:val="0"/>
+              </w:rPr>
+              <w:t xml:space="preserve">2026-07-31</w:t>
+            </w:r>
+          </w:p>
+        </w:tc>
+      </w:tr>
     </w:tbl>
     <w:p>
       <w:pPr>
@@ -668,7 +770,7 @@
               <w:rPr>
                 <w:rtl w:val="0"/>
               </w:rPr>
-              <w:t xml:space="preserve">Racing TV — Director of Content</w:t>
+              <w:t xml:space="preserve">Racing TV / RMG — Director of Content (via PSD Group)</w:t>
             </w:r>
           </w:p>
         </w:tc>
@@ -716,109 +818,7 @@
               <w:rPr>
                 <w:rtl w:val="0"/>
               </w:rPr>
-              <w:t xml:space="preserve">Permanent, above target salary; paused pending budget confirmation on their side</w:t>
-            </w:r>
-          </w:p>
-        </w:tc>
-        <w:tc>
-          <w:tcPr>
-            <w:shd w:fill="auto" w:val="clear"/>
-            <w:tcMar>
-              <w:top w:w="100.0" w:type="dxa"/>
-              <w:left w:w="100.0" w:type="dxa"/>
-              <w:bottom w:w="100.0" w:type="dxa"/>
-              <w:right w:w="100.0" w:type="dxa"/>
-            </w:tcMar>
-            <w:vAlign w:val="top"/>
-          </w:tcPr>
-          <w:p>
-            <w:pPr>
-              <w:jc w:val="left"/>
-              <w:rPr/>
-            </w:pPr>
-            <w:r>
-              <w:rPr>
-                <w:rtl w:val="0"/>
-              </w:rPr>
-              <w:t xml:space="preserve">2026-06-30</w:t>
-            </w:r>
-          </w:p>
-        </w:tc>
-      </w:tr>
-      <w:tr>
-        <w:trPr>
-          <w:cantSplit w:val="0"/>
-          <w:tblHeader w:val="0"/>
-        </w:trPr>
-        <w:tc>
-          <w:tcPr>
-            <w:shd w:fill="auto" w:val="clear"/>
-            <w:tcMar>
-              <w:top w:w="100.0" w:type="dxa"/>
-              <w:left w:w="100.0" w:type="dxa"/>
-              <w:bottom w:w="100.0" w:type="dxa"/>
-              <w:right w:w="100.0" w:type="dxa"/>
-            </w:tcMar>
-            <w:vAlign w:val="top"/>
-          </w:tcPr>
-          <w:p>
-            <w:pPr>
-              <w:jc w:val="left"/>
-              <w:rPr/>
-            </w:pPr>
-            <w:r>
-              <w:rPr>
-                <w:rtl w:val="0"/>
-              </w:rPr>
-              <w:t xml:space="preserve">RMG/PSD</w:t>
-            </w:r>
-          </w:p>
-        </w:tc>
-        <w:tc>
-          <w:tcPr>
-            <w:shd w:fill="auto" w:val="clear"/>
-            <w:tcMar>
-              <w:top w:w="100.0" w:type="dxa"/>
-              <w:left w:w="100.0" w:type="dxa"/>
-              <w:bottom w:w="100.0" w:type="dxa"/>
-              <w:right w:w="100.0" w:type="dxa"/>
-            </w:tcMar>
-            <w:vAlign w:val="top"/>
-          </w:tcPr>
-          <w:p>
-            <w:pPr>
-              <w:jc w:val="left"/>
-              <w:rPr/>
-            </w:pPr>
-            <w:r>
-              <w:rPr>
-                <w:rtl w:val="0"/>
-              </w:rPr>
-              <w:t xml:space="preserve">Corporate (Y)</w:t>
-            </w:r>
-          </w:p>
-        </w:tc>
-        <w:tc>
-          <w:tcPr>
-            <w:shd w:fill="auto" w:val="clear"/>
-            <w:tcMar>
-              <w:top w:w="100.0" w:type="dxa"/>
-              <w:left w:w="100.0" w:type="dxa"/>
-              <w:bottom w:w="100.0" w:type="dxa"/>
-              <w:right w:w="100.0" w:type="dxa"/>
-            </w:tcMar>
-            <w:vAlign w:val="top"/>
-          </w:tcPr>
-          <w:p>
-            <w:pPr>
-              <w:jc w:val="left"/>
-              <w:rPr/>
-            </w:pPr>
-            <w:r>
-              <w:rPr>
-                <w:rtl w:val="0"/>
-              </w:rPr>
-              <w:t xml:space="preserve">Reached shortlist; decision expected ~14 July 2026</w:t>
+              <w:t xml:space="preserve">Permanent, above target salary. Was double-listed as two separate pipeline entries (Racing TV + RMG/PSD) through late June/July — corrected to one entry this retro (2026-07-31). Shortlisted, then interview confirmed for Fri 31 July 2026 10:00 with panel incl. Russell Ferris (RMG). Outcome pending.</w:t>
             </w:r>
           </w:p>
         </w:tc>
@@ -1154,7 +1154,7 @@
               <w:rPr>
                 <w:rtl w:val="0"/>
               </w:rPr>
-              <w:t xml:space="preserve">No closures yet — baseline week</w:t>
+              <w:t xml:space="preserve">Still no closures — nothing has moved ACTIVE/PENDING → CLOSED (won or lost) in the month since baseline (30 June–31 July)</w:t>
             </w:r>
           </w:p>
         </w:tc>
@@ -1440,17 +1440,40 @@
         <w:rPr>
           <w:rtl w:val="0"/>
         </w:rPr>
-        <w:t xml:space="preserve">G.O.A.T. Paddle / ThriveWell Hub — confirm current paid/unpaid status. If paid, belongs in X (self-sufficiency income) directly; if advisory-only/unpaid, log here as a relationship worth tracking but not counted toward the goal yet.</w:t>
-      </w:r>
-    </w:p>
-    <w:p>
-      <w:pPr>
-        <w:rPr/>
-      </w:pPr>
-      <w:r>
-        <w:rPr>
-          <w:rtl w:val="0"/>
-        </w:rPr>
+        <w:t xml:space="preserve">G.O.A.T. Paddle / ThriveWell Hub — still advisory-only as of the ThriveWell Hub board meeting on 17 Jul 2026 and follow-up on 24 Jul 2026 — paid status STILL unconfirmed after a full month. Flag: this has been an open loop for 4+ weeks without resolution. If paid, belongs in X (self-sufficiency income) directly; if advisory-only/unpaid, it stays logged here as a relationship worth tracking but not counted toward the goal yet.</w:t>
+      </w:r>
+    </w:p>
+    <w:p>
+      <w:pPr>
+        <w:rPr/>
+      </w:pPr>
+      <w:r>
+        <w:rPr>
+          <w:rtl w:val="0"/>
+        </w:rPr>
+      </w:r>
+    </w:p>
+    <w:p>
+      <w:pPr>
+        <w:pStyle w:val="Heading2"/>
+        <w:rPr/>
+      </w:pPr>
+      <w:r>
+        <w:rPr>
+          <w:rtl w:val="0"/>
+        </w:rPr>
+        <w:t xml:space="preserve">Retro note — 2026-07-31</w:t>
+      </w:r>
+    </w:p>
+    <w:p>
+      <w:pPr>
+        <w:rPr/>
+      </w:pPr>
+      <w:r>
+        <w:rPr>
+          <w:rtl w:val="0"/>
+        </w:rPr>
+        <w:t xml:space="preserve">First real pipeline reconciliation since the 30 June baseline (a month gap, not weekly as intended). Two structural issues found and fixed: (1) Racing TV and RMG/PSD were being tracked as two separate opportunities when they are one; (2) ThriveWell Hub's paid/unpaid status has gone unresolved for 4+ weeks. Neither issue is disqualifying, but both mean the scoreboard hasn't been trustworthy. Keep this file live weekly, not monthly.</w:t>
       </w:r>
     </w:p>
     <w:sectPr>

</xml_diff>